<commit_message>
refactor: format decimal and template
</commit_message>
<xml_diff>
--- a/templates/template_report_kalibrasi.docx
+++ b/templates/template_report_kalibrasi.docx
@@ -506,17 +506,13 @@
               <w:jc w:val="center"/>
               <w:rPr>
                 <w:rFonts w:ascii="Times New Roman" w:eastAsia="Times New Roman" w:hAnsi="Times New Roman" w:cs="Times New Roman"/>
-                <w:b/>
-                <w:bCs/>
-                <w:sz w:val="24"/>
-                <w:szCs w:val="24"/>
-              </w:rPr>
-            </w:pPr>
-            <w:r>
-              <w:rPr>
-                <w:rFonts w:ascii="Times New Roman" w:eastAsia="Times New Roman" w:hAnsi="Times New Roman" w:cs="Times New Roman"/>
-                <w:b/>
-                <w:bCs/>
+                <w:sz w:val="24"/>
+                <w:szCs w:val="24"/>
+              </w:rPr>
+            </w:pPr>
+            <w:r>
+              <w:rPr>
+                <w:rFonts w:ascii="Times New Roman" w:eastAsia="Times New Roman" w:hAnsi="Times New Roman" w:cs="Times New Roman"/>
                 <w:sz w:val="24"/>
                 <w:szCs w:val="24"/>
               </w:rPr>
@@ -534,17 +530,13 @@
               <w:jc w:val="center"/>
               <w:rPr>
                 <w:rFonts w:ascii="Times New Roman" w:eastAsia="Times New Roman" w:hAnsi="Times New Roman" w:cs="Times New Roman"/>
-                <w:b/>
-                <w:bCs/>
-                <w:sz w:val="24"/>
-                <w:szCs w:val="24"/>
-              </w:rPr>
-            </w:pPr>
-            <w:r>
-              <w:rPr>
-                <w:rFonts w:ascii="Times New Roman" w:eastAsia="Times New Roman" w:hAnsi="Times New Roman" w:cs="Times New Roman"/>
-                <w:b/>
-                <w:bCs/>
+                <w:sz w:val="24"/>
+                <w:szCs w:val="24"/>
+              </w:rPr>
+            </w:pPr>
+            <w:r>
+              <w:rPr>
+                <w:rFonts w:ascii="Times New Roman" w:eastAsia="Times New Roman" w:hAnsi="Times New Roman" w:cs="Times New Roman"/>
                 <w:sz w:val="24"/>
                 <w:szCs w:val="24"/>
               </w:rPr>
@@ -562,17 +554,13 @@
               <w:jc w:val="center"/>
               <w:rPr>
                 <w:rFonts w:ascii="Times New Roman" w:eastAsia="Times New Roman" w:hAnsi="Times New Roman" w:cs="Times New Roman"/>
-                <w:b/>
-                <w:bCs/>
-                <w:sz w:val="24"/>
-                <w:szCs w:val="24"/>
-              </w:rPr>
-            </w:pPr>
-            <w:r>
-              <w:rPr>
-                <w:rFonts w:ascii="Times New Roman" w:eastAsia="Times New Roman" w:hAnsi="Times New Roman" w:cs="Times New Roman"/>
-                <w:b/>
-                <w:bCs/>
+                <w:sz w:val="24"/>
+                <w:szCs w:val="24"/>
+              </w:rPr>
+            </w:pPr>
+            <w:r>
+              <w:rPr>
+                <w:rFonts w:ascii="Times New Roman" w:eastAsia="Times New Roman" w:hAnsi="Times New Roman" w:cs="Times New Roman"/>
                 <w:sz w:val="24"/>
                 <w:szCs w:val="24"/>
               </w:rPr>
@@ -590,17 +578,13 @@
               <w:jc w:val="center"/>
               <w:rPr>
                 <w:rFonts w:ascii="Times New Roman" w:eastAsia="Times New Roman" w:hAnsi="Times New Roman" w:cs="Times New Roman"/>
-                <w:b/>
-                <w:bCs/>
-                <w:sz w:val="24"/>
-                <w:szCs w:val="24"/>
-              </w:rPr>
-            </w:pPr>
-            <w:r>
-              <w:rPr>
-                <w:rFonts w:ascii="Times New Roman" w:eastAsia="Times New Roman" w:hAnsi="Times New Roman" w:cs="Times New Roman"/>
-                <w:b/>
-                <w:bCs/>
+                <w:sz w:val="24"/>
+                <w:szCs w:val="24"/>
+              </w:rPr>
+            </w:pPr>
+            <w:r>
+              <w:rPr>
+                <w:rFonts w:ascii="Times New Roman" w:eastAsia="Times New Roman" w:hAnsi="Times New Roman" w:cs="Times New Roman"/>
                 <w:sz w:val="24"/>
                 <w:szCs w:val="24"/>
               </w:rPr>
@@ -691,7 +675,6 @@
           <w:p>
             <w:pPr>
               <w:spacing w:line="360" w:lineRule="auto"/>
-              <w:jc w:val="both"/>
               <w:rPr>
                 <w:rFonts w:ascii="Times New Roman" w:eastAsia="Times New Roman" w:hAnsi="Times New Roman" w:cs="Times New Roman"/>
                 <w:sz w:val="24"/>
@@ -715,7 +698,6 @@
           <w:p>
             <w:pPr>
               <w:spacing w:line="360" w:lineRule="auto"/>
-              <w:jc w:val="both"/>
               <w:rPr>
                 <w:rFonts w:ascii="Times New Roman" w:eastAsia="Times New Roman" w:hAnsi="Times New Roman" w:cs="Times New Roman"/>
                 <w:sz w:val="24"/>
@@ -731,7 +713,6 @@
           <w:p>
             <w:pPr>
               <w:spacing w:line="360" w:lineRule="auto"/>
-              <w:jc w:val="both"/>
               <w:rPr>
                 <w:rFonts w:ascii="Times New Roman" w:eastAsia="Times New Roman" w:hAnsi="Times New Roman" w:cs="Times New Roman"/>
                 <w:sz w:val="24"/>
@@ -773,7 +754,6 @@
           <w:p>
             <w:pPr>
               <w:spacing w:line="360" w:lineRule="auto"/>
-              <w:jc w:val="both"/>
               <w:rPr>
                 <w:rFonts w:ascii="Times New Roman" w:eastAsia="Times New Roman" w:hAnsi="Times New Roman" w:cs="Times New Roman"/>
                 <w:sz w:val="24"/>
@@ -797,7 +777,6 @@
           <w:p>
             <w:pPr>
               <w:spacing w:line="360" w:lineRule="auto"/>
-              <w:jc w:val="both"/>
               <w:rPr>
                 <w:rFonts w:ascii="Times New Roman" w:eastAsia="Times New Roman" w:hAnsi="Times New Roman" w:cs="Times New Roman"/>
                 <w:sz w:val="24"/>
@@ -821,7 +800,6 @@
           <w:p>
             <w:pPr>
               <w:spacing w:line="360" w:lineRule="auto"/>
-              <w:jc w:val="both"/>
               <w:rPr>
                 <w:rFonts w:ascii="Times New Roman" w:eastAsia="Times New Roman" w:hAnsi="Times New Roman" w:cs="Times New Roman"/>
                 <w:sz w:val="24"/>
@@ -1590,17 +1568,13 @@
               <w:jc w:val="center"/>
               <w:rPr>
                 <w:rFonts w:ascii="Times New Roman" w:eastAsia="Times New Roman" w:hAnsi="Times New Roman" w:cs="Times New Roman"/>
-                <w:b/>
-                <w:bCs/>
-                <w:sz w:val="24"/>
-                <w:szCs w:val="24"/>
-              </w:rPr>
-            </w:pPr>
-            <w:r>
-              <w:rPr>
-                <w:rFonts w:ascii="Times New Roman" w:eastAsia="Times New Roman" w:hAnsi="Times New Roman" w:cs="Times New Roman"/>
-                <w:b/>
-                <w:bCs/>
+                <w:sz w:val="24"/>
+                <w:szCs w:val="24"/>
+              </w:rPr>
+            </w:pPr>
+            <w:r>
+              <w:rPr>
+                <w:rFonts w:ascii="Times New Roman" w:eastAsia="Times New Roman" w:hAnsi="Times New Roman" w:cs="Times New Roman"/>
                 <w:sz w:val="24"/>
                 <w:szCs w:val="24"/>
               </w:rPr>
@@ -1618,17 +1592,13 @@
               <w:jc w:val="center"/>
               <w:rPr>
                 <w:rFonts w:ascii="Times New Roman" w:eastAsia="Times New Roman" w:hAnsi="Times New Roman" w:cs="Times New Roman"/>
-                <w:b/>
-                <w:bCs/>
-                <w:sz w:val="24"/>
-                <w:szCs w:val="24"/>
-              </w:rPr>
-            </w:pPr>
-            <w:r>
-              <w:rPr>
-                <w:rFonts w:ascii="Times New Roman" w:eastAsia="Times New Roman" w:hAnsi="Times New Roman" w:cs="Times New Roman"/>
-                <w:b/>
-                <w:bCs/>
+                <w:sz w:val="24"/>
+                <w:szCs w:val="24"/>
+              </w:rPr>
+            </w:pPr>
+            <w:r>
+              <w:rPr>
+                <w:rFonts w:ascii="Times New Roman" w:eastAsia="Times New Roman" w:hAnsi="Times New Roman" w:cs="Times New Roman"/>
                 <w:sz w:val="24"/>
                 <w:szCs w:val="24"/>
               </w:rPr>
@@ -1646,17 +1616,13 @@
               <w:jc w:val="center"/>
               <w:rPr>
                 <w:rFonts w:ascii="Times New Roman" w:eastAsia="Times New Roman" w:hAnsi="Times New Roman" w:cs="Times New Roman"/>
-                <w:b/>
-                <w:bCs/>
-                <w:sz w:val="24"/>
-                <w:szCs w:val="24"/>
-              </w:rPr>
-            </w:pPr>
-            <w:r>
-              <w:rPr>
-                <w:rFonts w:ascii="Times New Roman" w:eastAsia="Times New Roman" w:hAnsi="Times New Roman" w:cs="Times New Roman"/>
-                <w:b/>
-                <w:bCs/>
+                <w:sz w:val="24"/>
+                <w:szCs w:val="24"/>
+              </w:rPr>
+            </w:pPr>
+            <w:r>
+              <w:rPr>
+                <w:rFonts w:ascii="Times New Roman" w:eastAsia="Times New Roman" w:hAnsi="Times New Roman" w:cs="Times New Roman"/>
                 <w:sz w:val="24"/>
                 <w:szCs w:val="24"/>
               </w:rPr>
@@ -1674,17 +1640,13 @@
               <w:jc w:val="center"/>
               <w:rPr>
                 <w:rFonts w:ascii="Times New Roman" w:eastAsia="Times New Roman" w:hAnsi="Times New Roman" w:cs="Times New Roman"/>
-                <w:b/>
-                <w:bCs/>
-                <w:sz w:val="24"/>
-                <w:szCs w:val="24"/>
-              </w:rPr>
-            </w:pPr>
-            <w:r>
-              <w:rPr>
-                <w:rFonts w:ascii="Times New Roman" w:eastAsia="Times New Roman" w:hAnsi="Times New Roman" w:cs="Times New Roman"/>
-                <w:b/>
-                <w:bCs/>
+                <w:sz w:val="24"/>
+                <w:szCs w:val="24"/>
+              </w:rPr>
+            </w:pPr>
+            <w:r>
+              <w:rPr>
+                <w:rFonts w:ascii="Times New Roman" w:eastAsia="Times New Roman" w:hAnsi="Times New Roman" w:cs="Times New Roman"/>
                 <w:sz w:val="24"/>
                 <w:szCs w:val="24"/>
               </w:rPr>
@@ -1775,7 +1737,6 @@
           <w:p>
             <w:pPr>
               <w:spacing w:line="360" w:lineRule="auto"/>
-              <w:jc w:val="both"/>
               <w:rPr>
                 <w:rFonts w:ascii="Times New Roman" w:eastAsia="Times New Roman" w:hAnsi="Times New Roman" w:cs="Times New Roman"/>
                 <w:sz w:val="24"/>
@@ -1799,7 +1760,6 @@
           <w:p>
             <w:pPr>
               <w:spacing w:line="360" w:lineRule="auto"/>
-              <w:jc w:val="both"/>
               <w:rPr>
                 <w:rFonts w:ascii="Times New Roman" w:eastAsia="Times New Roman" w:hAnsi="Times New Roman" w:cs="Times New Roman"/>
                 <w:sz w:val="24"/>
@@ -1815,7 +1775,6 @@
           <w:p>
             <w:pPr>
               <w:spacing w:line="360" w:lineRule="auto"/>
-              <w:jc w:val="both"/>
               <w:rPr>
                 <w:rFonts w:ascii="Times New Roman" w:eastAsia="Times New Roman" w:hAnsi="Times New Roman" w:cs="Times New Roman"/>
                 <w:sz w:val="24"/>
@@ -1857,7 +1816,6 @@
           <w:p>
             <w:pPr>
               <w:spacing w:line="360" w:lineRule="auto"/>
-              <w:jc w:val="both"/>
               <w:rPr>
                 <w:rFonts w:ascii="Times New Roman" w:eastAsia="Times New Roman" w:hAnsi="Times New Roman" w:cs="Times New Roman"/>
                 <w:sz w:val="24"/>
@@ -1881,7 +1839,6 @@
           <w:p>
             <w:pPr>
               <w:spacing w:line="360" w:lineRule="auto"/>
-              <w:jc w:val="both"/>
               <w:rPr>
                 <w:rFonts w:ascii="Times New Roman" w:eastAsia="Times New Roman" w:hAnsi="Times New Roman" w:cs="Times New Roman"/>
                 <w:sz w:val="24"/>
@@ -1897,7 +1854,6 @@
           <w:p>
             <w:pPr>
               <w:spacing w:line="360" w:lineRule="auto"/>
-              <w:jc w:val="both"/>
               <w:rPr>
                 <w:rFonts w:ascii="Times New Roman" w:eastAsia="Times New Roman" w:hAnsi="Times New Roman" w:cs="Times New Roman"/>
                 <w:sz w:val="24"/>
@@ -2709,6 +2665,104 @@
               <w:jc w:val="center"/>
               <w:rPr>
                 <w:rFonts w:ascii="Times New Roman" w:eastAsia="Times New Roman" w:hAnsi="Times New Roman" w:cs="Times New Roman"/>
+                <w:sz w:val="24"/>
+                <w:szCs w:val="24"/>
+              </w:rPr>
+            </w:pPr>
+            <w:r>
+              <w:rPr>
+                <w:rFonts w:ascii="Times New Roman" w:eastAsia="Times New Roman" w:hAnsi="Times New Roman" w:cs="Times New Roman"/>
+                <w:sz w:val="24"/>
+                <w:szCs w:val="24"/>
+              </w:rPr>
+              <w:t xml:space="preserve">Parameter </w:t>
+            </w:r>
+          </w:p>
+        </w:tc>
+        <w:tc>
+          <w:tcPr>
+            <w:tcW w:w="1275" w:type="dxa"/>
+          </w:tcPr>
+          <w:p>
+            <w:pPr>
+              <w:spacing w:line="360" w:lineRule="auto"/>
+              <w:jc w:val="center"/>
+              <w:rPr>
+                <w:rFonts w:ascii="Times New Roman" w:eastAsia="Times New Roman" w:hAnsi="Times New Roman" w:cs="Times New Roman"/>
+                <w:sz w:val="24"/>
+                <w:szCs w:val="24"/>
+              </w:rPr>
+            </w:pPr>
+            <w:r>
+              <w:rPr>
+                <w:rFonts w:ascii="Times New Roman" w:eastAsia="Times New Roman" w:hAnsi="Times New Roman" w:cs="Times New Roman"/>
+                <w:sz w:val="24"/>
+                <w:szCs w:val="24"/>
+              </w:rPr>
+              <w:t xml:space="preserve">Nilai </w:t>
+            </w:r>
+          </w:p>
+        </w:tc>
+        <w:tc>
+          <w:tcPr>
+            <w:tcW w:w="1200" w:type="dxa"/>
+          </w:tcPr>
+          <w:p>
+            <w:pPr>
+              <w:spacing w:line="360" w:lineRule="auto"/>
+              <w:jc w:val="center"/>
+              <w:rPr>
+                <w:rFonts w:ascii="Times New Roman" w:eastAsia="Times New Roman" w:hAnsi="Times New Roman" w:cs="Times New Roman"/>
+                <w:sz w:val="24"/>
+                <w:szCs w:val="24"/>
+              </w:rPr>
+            </w:pPr>
+            <w:r>
+              <w:rPr>
+                <w:rFonts w:ascii="Times New Roman" w:eastAsia="Times New Roman" w:hAnsi="Times New Roman" w:cs="Times New Roman"/>
+                <w:sz w:val="24"/>
+                <w:szCs w:val="24"/>
+              </w:rPr>
+              <w:t xml:space="preserve">Satuan </w:t>
+            </w:r>
+          </w:p>
+        </w:tc>
+        <w:tc>
+          <w:tcPr>
+            <w:tcW w:w="3060" w:type="dxa"/>
+          </w:tcPr>
+          <w:p>
+            <w:pPr>
+              <w:spacing w:line="360" w:lineRule="auto"/>
+              <w:jc w:val="center"/>
+              <w:rPr>
+                <w:rFonts w:ascii="Times New Roman" w:eastAsia="Times New Roman" w:hAnsi="Times New Roman" w:cs="Times New Roman"/>
+                <w:sz w:val="24"/>
+                <w:szCs w:val="24"/>
+              </w:rPr>
+            </w:pPr>
+            <w:r>
+              <w:rPr>
+                <w:rFonts w:ascii="Times New Roman" w:eastAsia="Times New Roman" w:hAnsi="Times New Roman" w:cs="Times New Roman"/>
+                <w:sz w:val="24"/>
+                <w:szCs w:val="24"/>
+              </w:rPr>
+              <w:t xml:space="preserve">Keterangan </w:t>
+            </w:r>
+          </w:p>
+        </w:tc>
+      </w:tr>
+      <w:tr>
+        <w:tc>
+          <w:tcPr>
+            <w:tcW w:w="3180" w:type="dxa"/>
+          </w:tcPr>
+          <w:p>
+            <w:pPr>
+              <w:spacing w:line="360" w:lineRule="auto"/>
+              <w:jc w:val="center"/>
+              <w:rPr>
+                <w:rFonts w:ascii="Times New Roman" w:eastAsia="Times New Roman" w:hAnsi="Times New Roman" w:cs="Times New Roman"/>
                 <w:b/>
                 <w:bCs/>
                 <w:sz w:val="24"/>
@@ -2718,120 +2772,6 @@
             <w:r>
               <w:rPr>
                 <w:rFonts w:ascii="Times New Roman" w:eastAsia="Times New Roman" w:hAnsi="Times New Roman" w:cs="Times New Roman"/>
-                <w:b/>
-                <w:bCs/>
-                <w:sz w:val="24"/>
-                <w:szCs w:val="24"/>
-              </w:rPr>
-              <w:t xml:space="preserve">Parameter </w:t>
-            </w:r>
-          </w:p>
-        </w:tc>
-        <w:tc>
-          <w:tcPr>
-            <w:tcW w:w="1275" w:type="dxa"/>
-          </w:tcPr>
-          <w:p>
-            <w:pPr>
-              <w:spacing w:line="360" w:lineRule="auto"/>
-              <w:jc w:val="center"/>
-              <w:rPr>
-                <w:rFonts w:ascii="Times New Roman" w:eastAsia="Times New Roman" w:hAnsi="Times New Roman" w:cs="Times New Roman"/>
-                <w:b/>
-                <w:bCs/>
-                <w:sz w:val="24"/>
-                <w:szCs w:val="24"/>
-              </w:rPr>
-            </w:pPr>
-            <w:r>
-              <w:rPr>
-                <w:rFonts w:ascii="Times New Roman" w:eastAsia="Times New Roman" w:hAnsi="Times New Roman" w:cs="Times New Roman"/>
-                <w:b/>
-                <w:bCs/>
-                <w:sz w:val="24"/>
-                <w:szCs w:val="24"/>
-              </w:rPr>
-              <w:t xml:space="preserve">Nilai </w:t>
-            </w:r>
-          </w:p>
-        </w:tc>
-        <w:tc>
-          <w:tcPr>
-            <w:tcW w:w="1200" w:type="dxa"/>
-          </w:tcPr>
-          <w:p>
-            <w:pPr>
-              <w:spacing w:line="360" w:lineRule="auto"/>
-              <w:jc w:val="center"/>
-              <w:rPr>
-                <w:rFonts w:ascii="Times New Roman" w:eastAsia="Times New Roman" w:hAnsi="Times New Roman" w:cs="Times New Roman"/>
-                <w:b/>
-                <w:bCs/>
-                <w:sz w:val="24"/>
-                <w:szCs w:val="24"/>
-              </w:rPr>
-            </w:pPr>
-            <w:r>
-              <w:rPr>
-                <w:rFonts w:ascii="Times New Roman" w:eastAsia="Times New Roman" w:hAnsi="Times New Roman" w:cs="Times New Roman"/>
-                <w:b/>
-                <w:bCs/>
-                <w:sz w:val="24"/>
-                <w:szCs w:val="24"/>
-              </w:rPr>
-              <w:t xml:space="preserve">Satuan </w:t>
-            </w:r>
-          </w:p>
-        </w:tc>
-        <w:tc>
-          <w:tcPr>
-            <w:tcW w:w="3060" w:type="dxa"/>
-          </w:tcPr>
-          <w:p>
-            <w:pPr>
-              <w:spacing w:line="360" w:lineRule="auto"/>
-              <w:jc w:val="center"/>
-              <w:rPr>
-                <w:rFonts w:ascii="Times New Roman" w:eastAsia="Times New Roman" w:hAnsi="Times New Roman" w:cs="Times New Roman"/>
-                <w:b/>
-                <w:bCs/>
-                <w:sz w:val="24"/>
-                <w:szCs w:val="24"/>
-              </w:rPr>
-            </w:pPr>
-            <w:r>
-              <w:rPr>
-                <w:rFonts w:ascii="Times New Roman" w:eastAsia="Times New Roman" w:hAnsi="Times New Roman" w:cs="Times New Roman"/>
-                <w:b/>
-                <w:bCs/>
-                <w:sz w:val="24"/>
-                <w:szCs w:val="24"/>
-              </w:rPr>
-              <w:t xml:space="preserve">Keterangan </w:t>
-            </w:r>
-          </w:p>
-        </w:tc>
-      </w:tr>
-      <w:tr>
-        <w:tc>
-          <w:tcPr>
-            <w:tcW w:w="3180" w:type="dxa"/>
-          </w:tcPr>
-          <w:p>
-            <w:pPr>
-              <w:spacing w:line="360" w:lineRule="auto"/>
-              <w:jc w:val="center"/>
-              <w:rPr>
-                <w:rFonts w:ascii="Times New Roman" w:eastAsia="Times New Roman" w:hAnsi="Times New Roman" w:cs="Times New Roman"/>
-                <w:b/>
-                <w:bCs/>
-                <w:sz w:val="24"/>
-                <w:szCs w:val="24"/>
-              </w:rPr>
-            </w:pPr>
-            <w:r>
-              <w:rPr>
-                <w:rFonts w:ascii="Times New Roman" w:eastAsia="Times New Roman" w:hAnsi="Times New Roman" w:cs="Times New Roman"/>
                 <w:sz w:val="24"/>
                 <w:szCs w:val="24"/>
                 <w:lang w:val="en-US"/>
@@ -2846,8 +2786,9 @@
                 <w:szCs w:val="24"/>
                 <w:lang w:val="en-US"/>
               </w:rPr>
-              <w:t>showNh3nRegression</w:t>
-            </w:r>
+              <w:t>showNh3</w:t>
+            </w:r>
+            <w:proofErr w:type="gramStart"/>
             <w:r>
               <w:rPr>
                 <w:rFonts w:ascii="Times New Roman" w:eastAsia="Times New Roman" w:hAnsi="Times New Roman" w:cs="Times New Roman"/>
@@ -2855,6 +2796,15 @@
                 <w:szCs w:val="24"/>
                 <w:lang w:val="en-US"/>
               </w:rPr>
+              <w:t>nRegression</w:t>
+            </w:r>
+            <w:r>
+              <w:rPr>
+                <w:rFonts w:ascii="Times New Roman" w:eastAsia="Times New Roman" w:hAnsi="Times New Roman" w:cs="Times New Roman"/>
+                <w:sz w:val="24"/>
+                <w:szCs w:val="24"/>
+                <w:lang w:val="en-US"/>
+              </w:rPr>
               <w:t>}</w:t>
             </w:r>
             <w:r>
@@ -2863,7 +2813,16 @@
                 <w:sz w:val="24"/>
                 <w:szCs w:val="24"/>
               </w:rPr>
-              <w:t>Persamaan kalibrasi</w:t>
+              <w:t>Persamaan</w:t>
+            </w:r>
+            <w:proofErr w:type="gramEnd"/>
+            <w:r>
+              <w:rPr>
+                <w:rFonts w:ascii="Times New Roman" w:eastAsia="Times New Roman" w:hAnsi="Times New Roman" w:cs="Times New Roman"/>
+                <w:sz w:val="24"/>
+                <w:szCs w:val="24"/>
+              </w:rPr>
+              <w:t xml:space="preserve"> kalibrasi</w:t>
             </w:r>
           </w:p>
         </w:tc>
@@ -2947,7 +2906,6 @@
           <w:p>
             <w:pPr>
               <w:spacing w:line="360" w:lineRule="auto"/>
-              <w:jc w:val="center"/>
               <w:rPr>
                 <w:rFonts w:ascii="Times New Roman" w:eastAsia="Times New Roman" w:hAnsi="Times New Roman" w:cs="Times New Roman"/>
                 <w:b/>
@@ -3008,7 +2966,6 @@
           <w:p>
             <w:pPr>
               <w:spacing w:line="360" w:lineRule="auto"/>
-              <w:jc w:val="center"/>
               <w:rPr>
                 <w:rFonts w:ascii="Times New Roman" w:eastAsia="Times New Roman" w:hAnsi="Times New Roman" w:cs="Times New Roman"/>
                 <w:b/>
@@ -3026,7 +2983,6 @@
           <w:p>
             <w:pPr>
               <w:spacing w:line="360" w:lineRule="auto"/>
-              <w:jc w:val="center"/>
               <w:rPr>
                 <w:rFonts w:ascii="Times New Roman" w:eastAsia="Times New Roman" w:hAnsi="Times New Roman" w:cs="Times New Roman"/>
                 <w:b/>
@@ -3072,7 +3028,6 @@
           <w:p>
             <w:pPr>
               <w:spacing w:line="360" w:lineRule="auto"/>
-              <w:jc w:val="center"/>
               <w:rPr>
                 <w:rFonts w:ascii="Times New Roman" w:eastAsia="Times New Roman" w:hAnsi="Times New Roman" w:cs="Times New Roman"/>
                 <w:b/>
@@ -3133,7 +3088,6 @@
           <w:p>
             <w:pPr>
               <w:spacing w:line="360" w:lineRule="auto"/>
-              <w:jc w:val="center"/>
               <w:rPr>
                 <w:rFonts w:ascii="Times New Roman" w:eastAsia="Times New Roman" w:hAnsi="Times New Roman" w:cs="Times New Roman"/>
                 <w:b/>
@@ -3151,7 +3105,6 @@
           <w:p>
             <w:pPr>
               <w:spacing w:line="360" w:lineRule="auto"/>
-              <w:jc w:val="center"/>
               <w:rPr>
                 <w:rFonts w:ascii="Times New Roman" w:eastAsia="Times New Roman" w:hAnsi="Times New Roman" w:cs="Times New Roman"/>
                 <w:b/>
@@ -4409,8 +4362,12 @@
       </w:r>
     </w:p>
     <w:sectPr>
-      <w:headerReference w:type="default" r:id="rId10"/>
-      <w:footerReference w:type="default" r:id="rId11"/>
+      <w:headerReference w:type="even" r:id="rId10"/>
+      <w:headerReference w:type="default" r:id="rId11"/>
+      <w:footerReference w:type="even" r:id="rId12"/>
+      <w:footerReference w:type="default" r:id="rId13"/>
+      <w:headerReference w:type="first" r:id="rId14"/>
+      <w:footerReference w:type="first" r:id="rId15"/>
       <w:pgSz w:w="11906" w:h="16838"/>
       <w:pgMar w:top="1814" w:right="1440" w:bottom="1440" w:left="1440" w:header="708" w:footer="1591" w:gutter="0"/>
       <w:pgNumType w:start="1"/>
@@ -4447,6 +4404,16 @@
 
 <file path=word/footer1.xml><?xml version="1.0" encoding="utf-8"?>
 <w:ftr xmlns:wpc="http://schemas.microsoft.com/office/word/2010/wordprocessingCanvas" xmlns:cx="http://schemas.microsoft.com/office/drawing/2014/chartex" xmlns:cx1="http://schemas.microsoft.com/office/drawing/2015/9/8/chartex" xmlns:cx2="http://schemas.microsoft.com/office/drawing/2015/10/21/chartex" xmlns:cx3="http://schemas.microsoft.com/office/drawing/2016/5/9/chartex" xmlns:cx4="http://schemas.microsoft.com/office/drawing/2016/5/10/chartex" xmlns:cx5="http://schemas.microsoft.com/office/drawing/2016/5/11/chartex" xmlns:cx6="http://schemas.microsoft.com/office/drawing/2016/5/12/chartex" xmlns:cx7="http://schemas.microsoft.com/office/drawing/2016/5/13/chartex" xmlns:cx8="http://schemas.microsoft.com/office/drawing/2016/5/14/chartex" xmlns:mc="http://schemas.openxmlformats.org/markup-compatibility/2006" xmlns:aink="http://schemas.microsoft.com/office/drawing/2016/ink" xmlns:am3d="http://schemas.microsoft.com/office/drawing/2017/model3d" xmlns:o="urn:schemas-microsoft-com:office:office" xmlns:r="http://schemas.openxmlformats.org/officeDocument/2006/relationships" xmlns:m="http://schemas.openxmlformats.org/officeDocument/2006/math" xmlns:v="urn:schemas-microsoft-com:vml" xmlns:wp14="http://schemas.microsoft.com/office/word/2010/wordprocessingDrawing" xmlns:wp="http://schemas.openxmlformats.org/drawingml/2006/wordprocessingDrawing" xmlns:w10="urn:schemas-microsoft-com:office:word" xmlns:w="http://schemas.openxmlformats.org/wordprocessingml/2006/main" xmlns:w14="http://schemas.microsoft.com/office/word/2010/wordml" xmlns:w15="http://schemas.microsoft.com/office/word/2012/wordml" xmlns:w16cex="http://schemas.microsoft.com/office/word/2018/wordml/cex" xmlns:w16cid="http://schemas.microsoft.com/office/word/2016/wordml/cid" xmlns:w16="http://schemas.microsoft.com/office/word/2018/wordml" xmlns:w16sdtdh="http://schemas.microsoft.com/office/word/2020/wordml/sdtdatahash" xmlns:w16se="http://schemas.microsoft.com/office/word/2015/wordml/symex" xmlns:wpg="http://schemas.microsoft.com/office/word/2010/wordprocessingGroup" xmlns:wpi="http://schemas.microsoft.com/office/word/2010/wordprocessingInk" xmlns:wne="http://schemas.microsoft.com/office/word/2006/wordml" xmlns:wps="http://schemas.microsoft.com/office/word/2010/wordprocessingShape" mc:Ignorable="w14 w15 w16se w16cid w16 w16cex w16sdtdh wp14">
+  <w:p>
+    <w:pPr>
+      <w:pStyle w:val="Footer"/>
+    </w:pPr>
+  </w:p>
+</w:ftr>
+</file>
+
+<file path=word/footer2.xml><?xml version="1.0" encoding="utf-8"?>
+<w:ftr xmlns:wpc="http://schemas.microsoft.com/office/word/2010/wordprocessingCanvas" xmlns:cx="http://schemas.microsoft.com/office/drawing/2014/chartex" xmlns:cx1="http://schemas.microsoft.com/office/drawing/2015/9/8/chartex" xmlns:cx2="http://schemas.microsoft.com/office/drawing/2015/10/21/chartex" xmlns:cx3="http://schemas.microsoft.com/office/drawing/2016/5/9/chartex" xmlns:cx4="http://schemas.microsoft.com/office/drawing/2016/5/10/chartex" xmlns:cx5="http://schemas.microsoft.com/office/drawing/2016/5/11/chartex" xmlns:cx6="http://schemas.microsoft.com/office/drawing/2016/5/12/chartex" xmlns:cx7="http://schemas.microsoft.com/office/drawing/2016/5/13/chartex" xmlns:cx8="http://schemas.microsoft.com/office/drawing/2016/5/14/chartex" xmlns:mc="http://schemas.openxmlformats.org/markup-compatibility/2006" xmlns:aink="http://schemas.microsoft.com/office/drawing/2016/ink" xmlns:am3d="http://schemas.microsoft.com/office/drawing/2017/model3d" xmlns:o="urn:schemas-microsoft-com:office:office" xmlns:r="http://schemas.openxmlformats.org/officeDocument/2006/relationships" xmlns:m="http://schemas.openxmlformats.org/officeDocument/2006/math" xmlns:v="urn:schemas-microsoft-com:vml" xmlns:wp14="http://schemas.microsoft.com/office/word/2010/wordprocessingDrawing" xmlns:wp="http://schemas.openxmlformats.org/drawingml/2006/wordprocessingDrawing" xmlns:w10="urn:schemas-microsoft-com:office:word" xmlns:w="http://schemas.openxmlformats.org/wordprocessingml/2006/main" xmlns:w14="http://schemas.microsoft.com/office/word/2010/wordml" xmlns:w15="http://schemas.microsoft.com/office/word/2012/wordml" xmlns:w16cex="http://schemas.microsoft.com/office/word/2018/wordml/cex" xmlns:w16cid="http://schemas.microsoft.com/office/word/2016/wordml/cid" xmlns:w16="http://schemas.microsoft.com/office/word/2018/wordml" xmlns:w16sdtdh="http://schemas.microsoft.com/office/word/2020/wordml/sdtdatahash" xmlns:w16se="http://schemas.microsoft.com/office/word/2015/wordml/symex" xmlns:wpg="http://schemas.microsoft.com/office/word/2010/wordprocessingGroup" xmlns:wpi="http://schemas.microsoft.com/office/word/2010/wordprocessingInk" xmlns:wne="http://schemas.microsoft.com/office/word/2006/wordml" xmlns:wps="http://schemas.microsoft.com/office/word/2010/wordprocessingShape" mc:Ignorable="w14 w15 w16se w16cid w16 w16cex w16sdtdh wp14">
   <w:bookmarkStart w:id="0" w:name="bookmark=id.30j0zll" w:colFirst="0" w:colLast="0"/>
   <w:bookmarkEnd w:id="0"/>
   <w:p>
@@ -4456,7 +4423,7 @@
     </w:pPr>
     <w:r>
       <w:rPr>
-        <w:rFonts w:ascii="Calibri" w:eastAsia="Calibri" w:hAnsi="Calibri" w:cs="Calibri"/>
+        <w:rFonts w:eastAsia="Calibri"/>
         <w:color w:val="000000"/>
         <w:sz w:val="22"/>
         <w:szCs w:val="22"/>
@@ -4481,10 +4448,10 @@
           <v:path o:extrusionok="f" gradientshapeok="t" o:connecttype="rect"/>
           <o:lock v:ext="edit" aspectratio="t"/>
         </v:shapetype>
-        <v:shape id="4098" o:spid="_x0000_i1025" type="#_x0000_t75" style="width:450.8pt;height:6.9pt;visibility:visible;mso-wrap-distance-left:0;mso-wrap-distance-right:0">
+        <v:shape id="4098" o:spid="_x0000_i1025" type="#_x0000_t75" style="width:450.5pt;height:7pt;visibility:visible;mso-wrap-distance-left:0;mso-wrap-distance-right:0">
           <v:imagedata r:id="rId1" o:title="" embosscolor="white"/>
         </v:shape>
-        <o:OLEObject Type="Embed" ProgID="CorelDraw.Graphic.16" ShapeID="4098" DrawAspect="Content" ObjectID="_1842768033" r:id="rId2"/>
+        <o:OLEObject Type="Embed" ProgID="CorelDraw.Graphic.16" ShapeID="4098" DrawAspect="Content" ObjectID="_1843650887" r:id="rId2"/>
       </w:object>
     </w:r>
     <w:r>
@@ -4718,6 +4685,7 @@
     <w:r>
       <w:rPr>
         <w:rStyle w:val="apple-tab-span"/>
+        <w:rFonts w:ascii="Times New Roman" w:hAnsi="Times New Roman" w:cs="Times New Roman"/>
         <w:color w:val="000000"/>
         <w:sz w:val="20"/>
         <w:szCs w:val="20"/>
@@ -4727,6 +4695,7 @@
     <w:r>
       <w:rPr>
         <w:rStyle w:val="apple-tab-span"/>
+        <w:rFonts w:ascii="Times New Roman" w:hAnsi="Times New Roman" w:cs="Times New Roman"/>
         <w:color w:val="000000"/>
         <w:sz w:val="20"/>
         <w:szCs w:val="20"/>
@@ -4736,6 +4705,7 @@
     <w:r>
       <w:rPr>
         <w:rStyle w:val="apple-tab-span"/>
+        <w:rFonts w:ascii="Times New Roman" w:hAnsi="Times New Roman" w:cs="Times New Roman"/>
         <w:color w:val="000000"/>
         <w:sz w:val="20"/>
         <w:szCs w:val="20"/>
@@ -4745,6 +4715,7 @@
     </w:r>
     <w:r>
       <w:rPr>
+        <w:rFonts w:ascii="Times New Roman" w:hAnsi="Times New Roman" w:cs="Times New Roman"/>
         <w:color w:val="000000"/>
         <w:sz w:val="20"/>
         <w:szCs w:val="20"/>
@@ -4752,6 +4723,19 @@
       <w:t>http://www.getsensync.com</w:t>
     </w:r>
   </w:p>
+  <w:p>
+    <w:pPr>
+      <w:pStyle w:val="Footer"/>
+      <w:rPr>
+        <w:rFonts w:ascii="Times New Roman" w:hAnsi="Times New Roman" w:cs="Times New Roman"/>
+      </w:rPr>
+    </w:pPr>
+  </w:p>
+</w:ftr>
+</file>
+
+<file path=word/footer3.xml><?xml version="1.0" encoding="utf-8"?>
+<w:ftr xmlns:wpc="http://schemas.microsoft.com/office/word/2010/wordprocessingCanvas" xmlns:cx="http://schemas.microsoft.com/office/drawing/2014/chartex" xmlns:cx1="http://schemas.microsoft.com/office/drawing/2015/9/8/chartex" xmlns:cx2="http://schemas.microsoft.com/office/drawing/2015/10/21/chartex" xmlns:cx3="http://schemas.microsoft.com/office/drawing/2016/5/9/chartex" xmlns:cx4="http://schemas.microsoft.com/office/drawing/2016/5/10/chartex" xmlns:cx5="http://schemas.microsoft.com/office/drawing/2016/5/11/chartex" xmlns:cx6="http://schemas.microsoft.com/office/drawing/2016/5/12/chartex" xmlns:cx7="http://schemas.microsoft.com/office/drawing/2016/5/13/chartex" xmlns:cx8="http://schemas.microsoft.com/office/drawing/2016/5/14/chartex" xmlns:mc="http://schemas.openxmlformats.org/markup-compatibility/2006" xmlns:aink="http://schemas.microsoft.com/office/drawing/2016/ink" xmlns:am3d="http://schemas.microsoft.com/office/drawing/2017/model3d" xmlns:o="urn:schemas-microsoft-com:office:office" xmlns:r="http://schemas.openxmlformats.org/officeDocument/2006/relationships" xmlns:m="http://schemas.openxmlformats.org/officeDocument/2006/math" xmlns:v="urn:schemas-microsoft-com:vml" xmlns:wp14="http://schemas.microsoft.com/office/word/2010/wordprocessingDrawing" xmlns:wp="http://schemas.openxmlformats.org/drawingml/2006/wordprocessingDrawing" xmlns:w10="urn:schemas-microsoft-com:office:word" xmlns:w="http://schemas.openxmlformats.org/wordprocessingml/2006/main" xmlns:w14="http://schemas.microsoft.com/office/word/2010/wordml" xmlns:w15="http://schemas.microsoft.com/office/word/2012/wordml" xmlns:w16cex="http://schemas.microsoft.com/office/word/2018/wordml/cex" xmlns:w16cid="http://schemas.microsoft.com/office/word/2016/wordml/cid" xmlns:w16="http://schemas.microsoft.com/office/word/2018/wordml" xmlns:w16sdtdh="http://schemas.microsoft.com/office/word/2020/wordml/sdtdatahash" xmlns:w16se="http://schemas.microsoft.com/office/word/2015/wordml/symex" xmlns:wpg="http://schemas.microsoft.com/office/word/2010/wordprocessingGroup" xmlns:wpi="http://schemas.microsoft.com/office/word/2010/wordprocessingInk" xmlns:wne="http://schemas.microsoft.com/office/word/2006/wordml" xmlns:wps="http://schemas.microsoft.com/office/word/2010/wordprocessingShape" mc:Ignorable="w14 w15 w16se w16cid w16 w16cex w16sdtdh wp14">
   <w:p>
     <w:pPr>
       <w:pStyle w:val="Footer"/>
@@ -4786,6 +4770,16 @@
 </file>
 
 <file path=word/header1.xml><?xml version="1.0" encoding="utf-8"?>
+<w:hdr xmlns:wpc="http://schemas.microsoft.com/office/word/2010/wordprocessingCanvas" xmlns:cx="http://schemas.microsoft.com/office/drawing/2014/chartex" xmlns:cx1="http://schemas.microsoft.com/office/drawing/2015/9/8/chartex" xmlns:cx2="http://schemas.microsoft.com/office/drawing/2015/10/21/chartex" xmlns:cx3="http://schemas.microsoft.com/office/drawing/2016/5/9/chartex" xmlns:cx4="http://schemas.microsoft.com/office/drawing/2016/5/10/chartex" xmlns:cx5="http://schemas.microsoft.com/office/drawing/2016/5/11/chartex" xmlns:cx6="http://schemas.microsoft.com/office/drawing/2016/5/12/chartex" xmlns:cx7="http://schemas.microsoft.com/office/drawing/2016/5/13/chartex" xmlns:cx8="http://schemas.microsoft.com/office/drawing/2016/5/14/chartex" xmlns:mc="http://schemas.openxmlformats.org/markup-compatibility/2006" xmlns:aink="http://schemas.microsoft.com/office/drawing/2016/ink" xmlns:am3d="http://schemas.microsoft.com/office/drawing/2017/model3d" xmlns:o="urn:schemas-microsoft-com:office:office" xmlns:r="http://schemas.openxmlformats.org/officeDocument/2006/relationships" xmlns:m="http://schemas.openxmlformats.org/officeDocument/2006/math" xmlns:v="urn:schemas-microsoft-com:vml" xmlns:wp14="http://schemas.microsoft.com/office/word/2010/wordprocessingDrawing" xmlns:wp="http://schemas.openxmlformats.org/drawingml/2006/wordprocessingDrawing" xmlns:w10="urn:schemas-microsoft-com:office:word" xmlns:w="http://schemas.openxmlformats.org/wordprocessingml/2006/main" xmlns:w14="http://schemas.microsoft.com/office/word/2010/wordml" xmlns:w15="http://schemas.microsoft.com/office/word/2012/wordml" xmlns:w16cex="http://schemas.microsoft.com/office/word/2018/wordml/cex" xmlns:w16cid="http://schemas.microsoft.com/office/word/2016/wordml/cid" xmlns:w16="http://schemas.microsoft.com/office/word/2018/wordml" xmlns:w16sdtdh="http://schemas.microsoft.com/office/word/2020/wordml/sdtdatahash" xmlns:w16se="http://schemas.microsoft.com/office/word/2015/wordml/symex" xmlns:wpg="http://schemas.microsoft.com/office/word/2010/wordprocessingGroup" xmlns:wpi="http://schemas.microsoft.com/office/word/2010/wordprocessingInk" xmlns:wne="http://schemas.microsoft.com/office/word/2006/wordml" xmlns:wps="http://schemas.microsoft.com/office/word/2010/wordprocessingShape" mc:Ignorable="w14 w15 w16se w16cid w16 w16cex w16sdtdh wp14">
+  <w:p>
+    <w:pPr>
+      <w:pStyle w:val="Header"/>
+    </w:pPr>
+  </w:p>
+</w:hdr>
+</file>
+
+<file path=word/header2.xml><?xml version="1.0" encoding="utf-8"?>
 <w:hdr xmlns:wpc="http://schemas.microsoft.com/office/word/2010/wordprocessingCanvas" xmlns:cx="http://schemas.microsoft.com/office/drawing/2014/chartex" xmlns:cx1="http://schemas.microsoft.com/office/drawing/2015/9/8/chartex" xmlns:cx2="http://schemas.microsoft.com/office/drawing/2015/10/21/chartex" xmlns:cx3="http://schemas.microsoft.com/office/drawing/2016/5/9/chartex" xmlns:cx4="http://schemas.microsoft.com/office/drawing/2016/5/10/chartex" xmlns:cx5="http://schemas.microsoft.com/office/drawing/2016/5/11/chartex" xmlns:cx6="http://schemas.microsoft.com/office/drawing/2016/5/12/chartex" xmlns:cx7="http://schemas.microsoft.com/office/drawing/2016/5/13/chartex" xmlns:cx8="http://schemas.microsoft.com/office/drawing/2016/5/14/chartex" xmlns:mc="http://schemas.openxmlformats.org/markup-compatibility/2006" xmlns:aink="http://schemas.microsoft.com/office/drawing/2016/ink" xmlns:am3d="http://schemas.microsoft.com/office/drawing/2017/model3d" xmlns:o="urn:schemas-microsoft-com:office:office" xmlns:r="http://schemas.openxmlformats.org/officeDocument/2006/relationships" xmlns:m="http://schemas.openxmlformats.org/officeDocument/2006/math" xmlns:v="urn:schemas-microsoft-com:vml" xmlns:wp14="http://schemas.microsoft.com/office/word/2010/wordprocessingDrawing" xmlns:wp="http://schemas.openxmlformats.org/drawingml/2006/wordprocessingDrawing" xmlns:w10="urn:schemas-microsoft-com:office:word" xmlns:w="http://schemas.openxmlformats.org/wordprocessingml/2006/main" xmlns:w14="http://schemas.microsoft.com/office/word/2010/wordml" xmlns:w15="http://schemas.microsoft.com/office/word/2012/wordml" xmlns:w16cex="http://schemas.microsoft.com/office/word/2018/wordml/cex" xmlns:w16cid="http://schemas.microsoft.com/office/word/2016/wordml/cid" xmlns:w16="http://schemas.microsoft.com/office/word/2018/wordml" xmlns:w16sdtdh="http://schemas.microsoft.com/office/word/2020/wordml/sdtdatahash" xmlns:w16se="http://schemas.microsoft.com/office/word/2015/wordml/symex" xmlns:wpg="http://schemas.microsoft.com/office/word/2010/wordprocessingGroup" xmlns:wpi="http://schemas.microsoft.com/office/word/2010/wordprocessingInk" xmlns:wne="http://schemas.microsoft.com/office/word/2006/wordml" xmlns:wps="http://schemas.microsoft.com/office/word/2010/wordprocessingShape" mc:Ignorable="w14 w15 w16se w16cid w16 w16cex w16sdtdh wp14">
   <w:p>
     <w:pPr>
@@ -4854,6 +4848,16 @@
         </wp:anchor>
       </w:drawing>
     </w:r>
+  </w:p>
+</w:hdr>
+</file>
+
+<file path=word/header3.xml><?xml version="1.0" encoding="utf-8"?>
+<w:hdr xmlns:wpc="http://schemas.microsoft.com/office/word/2010/wordprocessingCanvas" xmlns:cx="http://schemas.microsoft.com/office/drawing/2014/chartex" xmlns:cx1="http://schemas.microsoft.com/office/drawing/2015/9/8/chartex" xmlns:cx2="http://schemas.microsoft.com/office/drawing/2015/10/21/chartex" xmlns:cx3="http://schemas.microsoft.com/office/drawing/2016/5/9/chartex" xmlns:cx4="http://schemas.microsoft.com/office/drawing/2016/5/10/chartex" xmlns:cx5="http://schemas.microsoft.com/office/drawing/2016/5/11/chartex" xmlns:cx6="http://schemas.microsoft.com/office/drawing/2016/5/12/chartex" xmlns:cx7="http://schemas.microsoft.com/office/drawing/2016/5/13/chartex" xmlns:cx8="http://schemas.microsoft.com/office/drawing/2016/5/14/chartex" xmlns:mc="http://schemas.openxmlformats.org/markup-compatibility/2006" xmlns:aink="http://schemas.microsoft.com/office/drawing/2016/ink" xmlns:am3d="http://schemas.microsoft.com/office/drawing/2017/model3d" xmlns:o="urn:schemas-microsoft-com:office:office" xmlns:r="http://schemas.openxmlformats.org/officeDocument/2006/relationships" xmlns:m="http://schemas.openxmlformats.org/officeDocument/2006/math" xmlns:v="urn:schemas-microsoft-com:vml" xmlns:wp14="http://schemas.microsoft.com/office/word/2010/wordprocessingDrawing" xmlns:wp="http://schemas.openxmlformats.org/drawingml/2006/wordprocessingDrawing" xmlns:w10="urn:schemas-microsoft-com:office:word" xmlns:w="http://schemas.openxmlformats.org/wordprocessingml/2006/main" xmlns:w14="http://schemas.microsoft.com/office/word/2010/wordml" xmlns:w15="http://schemas.microsoft.com/office/word/2012/wordml" xmlns:w16cex="http://schemas.microsoft.com/office/word/2018/wordml/cex" xmlns:w16cid="http://schemas.microsoft.com/office/word/2016/wordml/cid" xmlns:w16="http://schemas.microsoft.com/office/word/2018/wordml" xmlns:w16sdtdh="http://schemas.microsoft.com/office/word/2020/wordml/sdtdatahash" xmlns:w16se="http://schemas.microsoft.com/office/word/2015/wordml/symex" xmlns:wpg="http://schemas.microsoft.com/office/word/2010/wordprocessingGroup" xmlns:wpi="http://schemas.microsoft.com/office/word/2010/wordprocessingInk" xmlns:wne="http://schemas.microsoft.com/office/word/2006/wordml" xmlns:wps="http://schemas.microsoft.com/office/word/2010/wordprocessingShape" mc:Ignorable="w14 w15 w16se w16cid w16 w16cex w16sdtdh wp14">
+  <w:p>
+    <w:pPr>
+      <w:pStyle w:val="Header"/>
+    </w:pPr>
   </w:p>
 </w:hdr>
 </file>
@@ -6078,28 +6082,28 @@
 </file>
 
 <file path=customXml/item1.xml><?xml version="1.0" encoding="utf-8"?>
-<b:Sources xmlns:b="http://schemas.openxmlformats.org/officeDocument/2006/bibliography" xmlns="http://schemas.openxmlformats.org/officeDocument/2006/bibliography" SelectedStyle="\APASixthEditionOfficeOnline.xsl" StyleName="APA" Version="6"/>
-</file>
-
-<file path=customXml/item2.xml><?xml version="1.0" encoding="utf-8"?>
 <go:gDocsCustomXmlDataStorage xmlns:go="http://customooxmlschemas.google.com/" xmlns:r="http://schemas.openxmlformats.org/officeDocument/2006/relationships" uri="GoogleDocsCustomDataVersion2">
   <go:docsCustomData xmlns:go="http://customooxmlschemas.google.com/" roundtripDataSignature="AMtx7mizTzFiuqvVN7xXvErdr3LxufNAwQ==">CgMxLjAyCWlkLmdqZGd4czgAciExZjZSRGM2SGNwQV8tYy12eUVxeDc1VXFFZDZLUkIwNHc=</go:docsCustomData>
 </go:gDocsCustomXmlDataStorage>
 </file>
 
-<file path=customXml/itemProps1.xml><?xml version="1.0" encoding="utf-8"?>
-<ds:datastoreItem xmlns:ds="http://schemas.openxmlformats.org/officeDocument/2006/customXml" ds:itemID="{3B667AE9-1455-4274-8204-A98B5D8E8026}">
-  <ds:schemaRefs>
-    <ds:schemaRef ds:uri="http://schemas.openxmlformats.org/officeDocument/2006/bibliography"/>
-  </ds:schemaRefs>
-</ds:datastoreItem>
+<file path=customXml/item2.xml><?xml version="1.0" encoding="utf-8"?>
+<b:Sources xmlns:b="http://schemas.openxmlformats.org/officeDocument/2006/bibliography" xmlns="http://schemas.openxmlformats.org/officeDocument/2006/bibliography" SelectedStyle="\APASixthEditionOfficeOnline.xsl" StyleName="APA" Version="6"/>
 </file>
 
-<file path=customXml/itemProps2.xml><?xml version="1.0" encoding="utf-8"?>
+<file path=customXml/itemProps1.xml><?xml version="1.0" encoding="utf-8"?>
 <ds:datastoreItem xmlns:ds="http://schemas.openxmlformats.org/officeDocument/2006/customXml" ds:itemID="{11111111-1234-1234-1234-123412341234}">
   <ds:schemaRefs>
     <ds:schemaRef ds:uri="http://customooxmlschemas.google.com/"/>
     <ds:schemaRef ds:uri="http://schemas.openxmlformats.org/officeDocument/2006/relationships"/>
   </ds:schemaRefs>
 </ds:datastoreItem>
+</file>
+
+<file path=customXml/itemProps2.xml><?xml version="1.0" encoding="utf-8"?>
+<ds:datastoreItem xmlns:ds="http://schemas.openxmlformats.org/officeDocument/2006/customXml" ds:itemID="{3B667AE9-1455-4274-8204-A98B5D8E8026}">
+  <ds:schemaRefs>
+    <ds:schemaRef ds:uri="http://schemas.openxmlformats.org/officeDocument/2006/bibliography"/>
+  </ds:schemaRefs>
+</ds:datastoreItem>
 </file>
</xml_diff>